<commit_message>
docs: update demo script for Mac-only recording (no second device)
Both demo-script.md and its Ukrainian translation assumed a phone as the
"second device" showing the Silpo app cart. Updated for recording entirely
on the Mac that runs the server: silpo.ua in a browser window instead of
the Silpo app on a phone, macOS's built-in screen recording (⌘⇧5), and the
PUBLIC_BASE_URL/cloudflared tunnel step is now explicitly skippable since
the OAuth link opens in a browser on the same machine — no phone WebView
involved. Regenerated docs/demo-script.docx from the updated Ukrainian
source.

Co-Authored-By: Claude Sonnet 5 <noreply@anthropic.com>
</commit_message>
<xml_diff>
--- a/docs/demo-script.docx
+++ b/docs/demo-script.docx
@@ -773,6 +773,7 @@
           <w:rFonts w:ascii="Arial" w:hAnsi="Arial" w:cs="Arial"/>
           <w:sz w:val="29"/>
           <w:sz-cs w:val="29"/>
+          <w:b/>
         </w:rPr>
         <w:t xml:space="preserve"/>
         <w:tab/>
@@ -785,9 +786,19 @@
           <w:rFonts w:ascii="Arial" w:hAnsi="Arial" w:cs="Arial"/>
           <w:sz w:val="29"/>
           <w:sz-cs w:val="29"/>
-          <w:spacing w:val="0"/>
-        </w:rPr>
-        <w:t xml:space="preserve">**</w:t>
+          <w:b/>
+          <w:spacing w:val="0"/>
+        </w:rPr>
+        <w:t xml:space="preserve">Запис на Mac, де працює сервер — тунель не потрібен.</w:t>
+      </w:r>
+      <w:r>
+        <w:rPr>
+          <w:rFonts w:ascii="Arial" w:hAnsi="Arial" w:cs="Arial"/>
+          <w:sz w:val="29"/>
+          <w:sz-cs w:val="29"/>
+          <w:spacing w:val="0"/>
+        </w:rPr>
+        <w:t xml:space="preserve"> </w:t>
       </w:r>
       <w:r>
         <w:rPr>
@@ -805,75 +816,57 @@
           <w:sz-cs w:val="29"/>
           <w:spacing w:val="0"/>
         </w:rPr>
-        <w:t xml:space="preserve"> має бути HTTPS-адресою, доступною з інтернету**, якщо посилання на вхід</w:t>
-      </w:r>
-    </w:p>
-    <w:p>
-      <w:pPr>
-        <w:spacing w:after="293"/>
-      </w:pPr>
-      <w:r>
-        <w:rPr>
-          <w:rFonts w:ascii="Arial" w:hAnsi="Arial" w:cs="Arial"/>
-          <w:sz w:val="29"/>
-          <w:sz-cs w:val="29"/>
-          <w:spacing w:val="0"/>
-        </w:rPr>
-        <w:t xml:space="preserve">відкриватиметься з телефону. </w:t>
-      </w:r>
-      <w:r>
-        <w:rPr>
-          <w:rFonts w:ascii="Courier" w:hAnsi="Courier" w:cs="Courier"/>
-          <w:sz w:val="29"/>
-          <w:sz-cs w:val="29"/>
-          <w:spacing w:val="0"/>
-        </w:rPr>
-        <w:t xml:space="preserve">cloudflared tunnel --url http://localhost:3000</w:t>
-      </w:r>
-      <w:r>
-        <w:rPr>
-          <w:rFonts w:ascii="Arial" w:hAnsi="Arial" w:cs="Arial"/>
-          <w:sz w:val="29"/>
-          <w:sz-cs w:val="29"/>
-          <w:spacing w:val="0"/>
-        </w:rPr>
-        <w:t xml:space="preserve">, вставте HTTPS-URL у </w:t>
-      </w:r>
-      <w:r>
-        <w:rPr>
-          <w:rFonts w:ascii="Courier" w:hAnsi="Courier" w:cs="Courier"/>
-          <w:sz w:val="29"/>
-          <w:sz-cs w:val="29"/>
-          <w:spacing w:val="0"/>
-        </w:rPr>
-        <w:t xml:space="preserve">.env</w:t>
-      </w:r>
-      <w:r>
-        <w:rPr>
-          <w:rFonts w:ascii="Arial" w:hAnsi="Arial" w:cs="Arial"/>
-          <w:sz w:val="29"/>
-          <w:sz-cs w:val="29"/>
-          <w:spacing w:val="0"/>
-        </w:rPr>
-        <w:t xml:space="preserve">, тоді </w:t>
-      </w:r>
-      <w:r>
-        <w:rPr>
-          <w:rFonts w:ascii="Courier" w:hAnsi="Courier" w:cs="Courier"/>
-          <w:sz w:val="29"/>
-          <w:sz-cs w:val="29"/>
-          <w:spacing w:val="0"/>
-        </w:rPr>
-        <w:t xml:space="preserve">DELETE FROM oauth_clients; DELETE FROM oauth_pending;</w:t>
-      </w:r>
-      <w:r>
-        <w:rPr>
-          <w:rFonts w:ascii="Arial" w:hAnsi="Arial" w:cs="Arial"/>
-          <w:sz w:val="29"/>
-          <w:sz-cs w:val="29"/>
-          <w:spacing w:val="0"/>
-        </w:rPr>
-        <w:t xml:space="preserve">, щоб DCR-клієнт перереєструвався з новим redirect_uri. Запис на комп'ютері, де працює сервер, обходиться без тунелю.</w:t>
+        <w:t xml:space="preserve"> має бути HTTPS-</w:t>
+      </w:r>
+    </w:p>
+    <w:p>
+      <w:pPr>
+        <w:spacing w:after="293"/>
+      </w:pPr>
+      <w:r>
+        <w:rPr>
+          <w:rFonts w:ascii="Arial" w:hAnsi="Arial" w:cs="Arial"/>
+          <w:sz w:val="29"/>
+          <w:sz-cs w:val="29"/>
+          <w:spacing w:val="0"/>
+        </w:rPr>
+        <w:t xml:space="preserve">адресою, доступною з інтернету, лише якщо посилання на вхід відкриватиметься на ІНШОМУ пристрої (напр. телефоні). Оскільки посилання відкривається в браузері на цьому ж Mac, </w:t>
+      </w:r>
+      <w:r>
+        <w:rPr>
+          <w:rFonts w:ascii="Courier" w:hAnsi="Courier" w:cs="Courier"/>
+          <w:sz w:val="29"/>
+          <w:sz-cs w:val="29"/>
+          <w:spacing w:val="0"/>
+        </w:rPr>
+        <w:t xml:space="preserve">http://localhost:3000</w:t>
+      </w:r>
+      <w:r>
+        <w:rPr>
+          <w:rFonts w:ascii="Arial" w:hAnsi="Arial" w:cs="Arial"/>
+          <w:sz w:val="29"/>
+          <w:sz-cs w:val="29"/>
+          <w:spacing w:val="0"/>
+        </w:rPr>
+        <w:t xml:space="preserve"> працює як є — крок із </w:t>
+      </w:r>
+      <w:r>
+        <w:rPr>
+          <w:rFonts w:ascii="Courier" w:hAnsi="Courier" w:cs="Courier"/>
+          <w:sz w:val="29"/>
+          <w:sz-cs w:val="29"/>
+          <w:spacing w:val="0"/>
+        </w:rPr>
+        <w:t xml:space="preserve">cloudflared</w:t>
+      </w:r>
+      <w:r>
+        <w:rPr>
+          <w:rFonts w:ascii="Arial" w:hAnsi="Arial" w:cs="Arial"/>
+          <w:sz w:val="29"/>
+          <w:sz-cs w:val="29"/>
+          <w:spacing w:val="0"/>
+        </w:rPr>
+        <w:t xml:space="preserve">/перереєстрацією DCR-клієнта можна повністю пропустити.</w:t>
       </w:r>
     </w:p>
     <w:p>
@@ -1175,6 +1168,7 @@
           <w:rFonts w:ascii="Arial" w:hAnsi="Arial" w:cs="Arial"/>
           <w:sz w:val="29"/>
           <w:sz-cs w:val="29"/>
+          <w:b/>
         </w:rPr>
         <w:t xml:space="preserve"/>
         <w:tab/>
@@ -1187,42 +1181,116 @@
           <w:rFonts w:ascii="Arial" w:hAnsi="Arial" w:cs="Arial"/>
           <w:sz w:val="29"/>
           <w:sz-cs w:val="29"/>
-          <w:spacing w:val="0"/>
-        </w:rPr>
-        <w:t xml:space="preserve">Тримайте </w:t>
-      </w:r>
-      <w:r>
-        <w:rPr>
-          <w:rFonts w:ascii="Arial" w:hAnsi="Arial" w:cs="Arial"/>
-          <w:sz w:val="29"/>
-          <w:sz-cs w:val="29"/>
-          <w:b/>
-          <w:spacing w:val="0"/>
-        </w:rPr>
-        <w:t xml:space="preserve">застосунок Сільпо</w:t>
-      </w:r>
-      <w:r>
-        <w:rPr>
-          <w:rFonts w:ascii="Arial" w:hAnsi="Arial" w:cs="Arial"/>
-          <w:sz w:val="29"/>
-          <w:sz-cs w:val="29"/>
-          <w:spacing w:val="0"/>
-        </w:rPr>
-        <w:t xml:space="preserve"> відкритим на другому пристрої, залогінений у той самий акаунт, на</w:t>
-      </w:r>
-    </w:p>
-    <w:p>
-      <w:pPr>
-        <w:spacing w:after="293"/>
-      </w:pPr>
-      <w:r>
-        <w:rPr>
-          <w:rFonts w:ascii="Arial" w:hAnsi="Arial" w:cs="Arial"/>
-          <w:sz w:val="29"/>
-          <w:sz-cs w:val="29"/>
-          <w:spacing w:val="0"/>
-        </w:rPr>
-        <w:t xml:space="preserve">екрані кошика. Найсильніший момент відео — коли той самий кошик з'являється там.</w:t>
+          <w:b/>
+          <w:spacing w:val="0"/>
+        </w:rPr>
+        <w:t xml:space="preserve">Запис повністю на Mac — другий пристрій не потрібен.</w:t>
+      </w:r>
+      <w:r>
+        <w:rPr>
+          <w:rFonts w:ascii="Arial" w:hAnsi="Arial" w:cs="Arial"/>
+          <w:sz w:val="29"/>
+          <w:sz-cs w:val="29"/>
+          <w:spacing w:val="0"/>
+        </w:rPr>
+        <w:t xml:space="preserve"> Відкрийте </w:t>
+      </w:r>
+      <w:r>
+        <w:rPr>
+          <w:rFonts w:ascii="Arial" w:hAnsi="Arial" w:cs="Arial"/>
+          <w:sz w:val="29"/>
+          <w:sz-cs w:val="29"/>
+          <w:b/>
+          <w:spacing w:val="0"/>
+        </w:rPr>
+        <w:t xml:space="preserve">Telegram</w:t>
+      </w:r>
+      <w:r>
+        <w:rPr>
+          <w:rFonts w:ascii="Arial" w:hAnsi="Arial" w:cs="Arial"/>
+          <w:sz w:val="29"/>
+          <w:sz-cs w:val="29"/>
+          <w:spacing w:val="0"/>
+        </w:rPr>
+        <w:t xml:space="preserve"> (десктопний</w:t>
+      </w:r>
+    </w:p>
+    <w:p>
+      <w:pPr>
+        <w:spacing w:after="293"/>
+      </w:pPr>
+      <w:r>
+        <w:rPr>
+          <w:rFonts w:ascii="Arial" w:hAnsi="Arial" w:cs="Arial"/>
+          <w:sz w:val="29"/>
+          <w:sz-cs w:val="29"/>
+          <w:spacing w:val="0"/>
+        </w:rPr>
+        <w:t xml:space="preserve">застосунок або </w:t>
+      </w:r>
+      <w:r>
+        <w:rPr>
+          <w:rFonts w:ascii="Courier" w:hAnsi="Courier" w:cs="Courier"/>
+          <w:sz w:val="29"/>
+          <w:sz-cs w:val="29"/>
+          <w:spacing w:val="0"/>
+        </w:rPr>
+        <w:t xml:space="preserve">web.telegram.org</w:t>
+      </w:r>
+      <w:r>
+        <w:rPr>
+          <w:rFonts w:ascii="Arial" w:hAnsi="Arial" w:cs="Arial"/>
+          <w:sz w:val="29"/>
+          <w:sz-cs w:val="29"/>
+          <w:spacing w:val="0"/>
+        </w:rPr>
+        <w:t xml:space="preserve">) в одному вікні та **</w:t>
+      </w:r>
+      <w:r>
+        <w:rPr>
+          <w:rFonts w:ascii="Courier" w:hAnsi="Courier" w:cs="Courier"/>
+          <w:sz w:val="29"/>
+          <w:sz-cs w:val="29"/>
+          <w:spacing w:val="0"/>
+        </w:rPr>
+        <w:t xml:space="preserve">silpo.ua</w:t>
+      </w:r>
+      <w:r>
+        <w:rPr>
+          <w:rFonts w:ascii="Arial" w:hAnsi="Arial" w:cs="Arial"/>
+          <w:sz w:val="29"/>
+          <w:sz-cs w:val="29"/>
+          <w:b/>
+          <w:spacing w:val="0"/>
+        </w:rPr>
+        <w:t xml:space="preserve"> (залогінений у той самий акаунт, на сторінці кошика) у вікні браузера — поруч або в окремих вкладках, між якими перемикаєтесь. Записуйте екран через </w:t>
+      </w:r>
+      <w:r>
+        <w:rPr>
+          <w:rFonts w:ascii="Arial" w:hAnsi="Arial" w:cs="Arial"/>
+          <w:sz w:val="29"/>
+          <w:sz-cs w:val="29"/>
+          <w:spacing w:val="0"/>
+        </w:rPr>
+        <w:t xml:space="preserve">⌘⇧5** (або QuickTime Player → File → New Screen Recording) — можна обрати «Record Selected Portion», щоб у кадр потрапляли лише Telegram і браузер. Найсильніший момент відео — коли той самий кошик з'являється на </w:t>
+      </w:r>
+      <w:r>
+        <w:rPr>
+          <w:rFonts w:ascii="Courier" w:hAnsi="Courier" w:cs="Courier"/>
+          <w:sz w:val="29"/>
+          <w:sz-cs w:val="29"/>
+          <w:spacing w:val="0"/>
+        </w:rPr>
+        <w:t xml:space="preserve">silpo.ua</w:t>
+      </w:r>
+      <w:r>
+        <w:rPr>
+          <w:rFonts w:ascii="Arial" w:hAnsi="Arial" w:cs="Arial"/>
+          <w:sz w:val="29"/>
+          <w:sz-cs w:val="29"/>
+          <w:spacing w:val="0"/>
+        </w:rPr>
+        <w:t xml:space="preserve"> одразу після натискання 🛒.</w:t>
       </w:r>
     </w:p>
     <w:p>
@@ -1778,19 +1846,27 @@
           <w:rFonts w:ascii="Arial" w:hAnsi="Arial" w:cs="Arial"/>
           <w:sz w:val="29"/>
           <w:sz-cs w:val="29"/>
-          <w:i/>
-          <w:spacing w:val="0"/>
-        </w:rPr>
-        <w:t xml:space="preserve">(Показати телефон: чат з одного боку, застосунок Сільпо з іншого — візуальний ряд для всього відео.)</w:t>
-      </w:r>
-      <w:r>
-        <w:rPr>
-          <w:rFonts w:ascii="Arial" w:hAnsi="Arial" w:cs="Arial"/>
-          <w:sz w:val="29"/>
-          <w:sz-cs w:val="29"/>
-          <w:spacing w:val="0"/>
-        </w:rPr>
-        <w:t xml:space="preserve"/>
+          <w:spacing w:val="0"/>
+        </w:rPr>
+        <w:t xml:space="preserve">*(Показати екран: Telegram з одного боку, </w:t>
+      </w:r>
+      <w:r>
+        <w:rPr>
+          <w:rFonts w:ascii="Courier" w:hAnsi="Courier" w:cs="Courier"/>
+          <w:sz w:val="29"/>
+          <w:sz-cs w:val="29"/>
+          <w:spacing w:val="0"/>
+        </w:rPr>
+        <w:t xml:space="preserve">silpo.ua</w:t>
+      </w:r>
+      <w:r>
+        <w:rPr>
+          <w:rFonts w:ascii="Arial" w:hAnsi="Arial" w:cs="Arial"/>
+          <w:sz w:val="29"/>
+          <w:sz-cs w:val="29"/>
+          <w:spacing w:val="0"/>
+        </w:rPr>
+        <w:t xml:space="preserve"> з іншого — візуальний ряд для всього відео.)*</w:t>
       </w:r>
     </w:p>
     <w:p>
@@ -2888,19 +2964,27 @@
           <w:rFonts w:ascii="Arial" w:hAnsi="Arial" w:cs="Arial"/>
           <w:sz w:val="29"/>
           <w:sz-cs w:val="29"/>
-          <w:b/>
-          <w:spacing w:val="0"/>
-        </w:rPr>
-        <w:t xml:space="preserve">Перейти в застосунок Сільпо</w:t>
-      </w:r>
-      <w:r>
-        <w:rPr>
-          <w:rFonts w:ascii="Arial" w:hAnsi="Arial" w:cs="Arial"/>
-          <w:sz w:val="29"/>
-          <w:sz-cs w:val="29"/>
-          <w:spacing w:val="0"/>
-        </w:rPr>
-        <w:t xml:space="preserve">, оновити кошик — ті самі товари, та сама філія, той самий слот. Затримати цей кадр на 2-3 секунди — це найсильніший момент усього відео. Зазначити, що бот свідомо зупиняється на посиланні на оформлення — у MCP немає інструмента для оформлення замовлення, і агент ніколи не має платити.</w:t>
+          <w:spacing w:val="0"/>
+        </w:rPr>
+        <w:t xml:space="preserve">**Перемкнутись на вікно браузера з </w:t>
+      </w:r>
+      <w:r>
+        <w:rPr>
+          <w:rFonts w:ascii="Courier" w:hAnsi="Courier" w:cs="Courier"/>
+          <w:sz w:val="29"/>
+          <w:sz-cs w:val="29"/>
+          <w:spacing w:val="0"/>
+        </w:rPr>
+        <w:t xml:space="preserve">silpo.ua</w:t>
+      </w:r>
+      <w:r>
+        <w:rPr>
+          <w:rFonts w:ascii="Arial" w:hAnsi="Arial" w:cs="Arial"/>
+          <w:sz w:val="29"/>
+          <w:sz-cs w:val="29"/>
+          <w:spacing w:val="0"/>
+        </w:rPr>
+        <w:t xml:space="preserve">** і оновити кошик — ті самі товари, та сама філія, той самий слот. (Найпростіший варіант: просто натиснути посилання бота на оформлення й одразу опинитись на тому самому кошику — окрема заздалегідь відкрита вкладка не обов'язкова.) Затримати цей кадр на 2-3 секунди — це найсильніший момент усього відео. Зазначити, що бот свідомо зупиняється на посиланні на оформлення — у MCP немає інструмента для оформлення замовлення, і агент ніколи не має платити.</w:t>
       </w:r>
     </w:p>
     <w:p>

</xml_diff>

<commit_message>
docs: shorten the spoken narration lines in the demo script
Every blockquote and narration cue in the beat-by-beat script (both
demo-script.md and demo-script.uk.md) was tightened — same claims, fewer
words per line — so the script is easier to actually deliver on camera
within the 4:50 timing budget without rushing. Regenerated
docs/demo-script.docx from the updated Ukrainian source.

Co-Authored-By: Claude Sonnet 5 <noreply@anthropic.com>
</commit_message>
<xml_diff>
--- a/docs/demo-script.docx
+++ b/docs/demo-script.docx
@@ -1594,57 +1594,32 @@
           <w:spacing w:val="0"/>
           <w:color w:val="343434"/>
         </w:rPr>
-        <w:t xml:space="preserve">«Що приготувати?» → «Що купити?» → 30-40 хвилин щотижня. Список пишеться десь окремо від</w:t>
-      </w:r>
-      <w:r>
-        <w:rPr>
-          <w:rFonts w:ascii="Arial" w:hAnsi="Arial" w:cs="Arial"/>
-          <w:sz w:val="29"/>
-          <w:sz-cs w:val="29"/>
-          <w:spacing w:val="0"/>
-          <w:color w:val="343434"/>
-        </w:rPr>
-        <w:t xml:space="preserve"/>
-      </w:r>
-    </w:p>
-    <w:p>
-      <w:pPr>
-        <w:spacing w:after="293"/>
-      </w:pPr>
-      <w:r>
-        <w:rPr>
-          <w:rFonts w:ascii="Arial" w:hAnsi="Arial" w:cs="Arial"/>
-          <w:sz w:val="29"/>
-          <w:sz-cs w:val="29"/>
-          <w:spacing w:val="0"/>
-          <w:color w:val="343434"/>
-        </w:rPr>
-        <w:t xml:space="preserve">застосунку, промо-акції перевіряються вибірково або не перевіряються взагалі, і кошик виходить</w:t>
-      </w:r>
-      <w:r>
-        <w:rPr>
-          <w:rFonts w:ascii="Arial" w:hAnsi="Arial" w:cs="Arial"/>
-          <w:sz w:val="29"/>
-          <w:sz-cs w:val="29"/>
-          <w:spacing w:val="0"/>
-          <w:color w:val="343434"/>
-        </w:rPr>
-        <w:t xml:space="preserve"/>
-      </w:r>
-    </w:p>
-    <w:p>
-      <w:pPr>
-        <w:spacing w:after="293"/>
-      </w:pPr>
-      <w:r>
-        <w:rPr>
-          <w:rFonts w:ascii="Arial" w:hAnsi="Arial" w:cs="Arial"/>
-          <w:sz w:val="29"/>
-          <w:sz-cs w:val="29"/>
-          <w:spacing w:val="0"/>
-          <w:color w:val="343434"/>
-        </w:rPr>
-        <w:t xml:space="preserve">дорожчим і менш повним, ніж міг би бути.</w:t>
+        <w:t xml:space="preserve">«Що приготувати?» → «Що купити?» — 30-40 хвилин щотижня. Список — окремо від застосунку, акції</w:t>
+      </w:r>
+      <w:r>
+        <w:rPr>
+          <w:rFonts w:ascii="Arial" w:hAnsi="Arial" w:cs="Arial"/>
+          <w:sz w:val="29"/>
+          <w:sz-cs w:val="29"/>
+          <w:spacing w:val="0"/>
+          <w:color w:val="343434"/>
+        </w:rPr>
+        <w:t xml:space="preserve"/>
+      </w:r>
+    </w:p>
+    <w:p>
+      <w:pPr>
+        <w:spacing w:after="293"/>
+      </w:pPr>
+      <w:r>
+        <w:rPr>
+          <w:rFonts w:ascii="Arial" w:hAnsi="Arial" w:cs="Arial"/>
+          <w:sz w:val="29"/>
+          <w:sz-cs w:val="29"/>
+          <w:spacing w:val="0"/>
+          <w:color w:val="343434"/>
+        </w:rPr>
+        <w:t xml:space="preserve">ніхто не перевіряє, і кошик виходить дорожчим, ніж міг би бути.</w:t>
       </w:r>
       <w:r>
         <w:rPr>
@@ -1684,57 +1659,32 @@
           <w:spacing w:val="0"/>
           <w:color w:val="343434"/>
         </w:rPr>
-        <w:t xml:space="preserve">Це та сама рутина для кожної родини, яка регулярно замовляє продукти в Сільпо — особливо коли</w:t>
-      </w:r>
-      <w:r>
-        <w:rPr>
-          <w:rFonts w:ascii="Arial" w:hAnsi="Arial" w:cs="Arial"/>
-          <w:sz w:val="29"/>
-          <w:sz-cs w:val="29"/>
-          <w:spacing w:val="0"/>
-          <w:color w:val="343434"/>
-        </w:rPr>
-        <w:t xml:space="preserve"/>
-      </w:r>
-    </w:p>
-    <w:p>
-      <w:pPr>
-        <w:spacing w:after="293"/>
-      </w:pPr>
-      <w:r>
-        <w:rPr>
-          <w:rFonts w:ascii="Arial" w:hAnsi="Arial" w:cs="Arial"/>
-          <w:sz w:val="29"/>
-          <w:sz-cs w:val="29"/>
-          <w:spacing w:val="0"/>
-          <w:color w:val="343434"/>
-        </w:rPr>
-        <w:t xml:space="preserve">є харчові обмеження чи алергії, які треба пам'ятати щоразу. Сільпо вже знає склад сім'ї,</w:t>
-      </w:r>
-      <w:r>
-        <w:rPr>
-          <w:rFonts w:ascii="Arial" w:hAnsi="Arial" w:cs="Arial"/>
-          <w:sz w:val="29"/>
-          <w:sz-cs w:val="29"/>
-          <w:spacing w:val="0"/>
-          <w:color w:val="343434"/>
-        </w:rPr>
-        <w:t xml:space="preserve"/>
-      </w:r>
-    </w:p>
-    <w:p>
-      <w:pPr>
-        <w:spacing w:after="293"/>
-      </w:pPr>
-      <w:r>
-        <w:rPr>
-          <w:rFonts w:ascii="Arial" w:hAnsi="Arial" w:cs="Arial"/>
-          <w:sz w:val="29"/>
-          <w:sz-cs w:val="29"/>
-          <w:spacing w:val="0"/>
-          <w:color w:val="343434"/>
-        </w:rPr>
-        <w:t xml:space="preserve">обмеження й адресу — просто ніхто не використовує ці дані, щоб відповісти на реальне запитання.</w:t>
+        <w:t xml:space="preserve">Це рутина кожної родини, яка регулярно замовляє в Сільпо — особливо з харчовими обмеженнями чи</w:t>
+      </w:r>
+      <w:r>
+        <w:rPr>
+          <w:rFonts w:ascii="Arial" w:hAnsi="Arial" w:cs="Arial"/>
+          <w:sz w:val="29"/>
+          <w:sz-cs w:val="29"/>
+          <w:spacing w:val="0"/>
+          <w:color w:val="343434"/>
+        </w:rPr>
+        <w:t xml:space="preserve"/>
+      </w:r>
+    </w:p>
+    <w:p>
+      <w:pPr>
+        <w:spacing w:after="293"/>
+      </w:pPr>
+      <w:r>
+        <w:rPr>
+          <w:rFonts w:ascii="Arial" w:hAnsi="Arial" w:cs="Arial"/>
+          <w:sz w:val="29"/>
+          <w:sz-cs w:val="29"/>
+          <w:spacing w:val="0"/>
+          <w:color w:val="343434"/>
+        </w:rPr>
+        <w:t xml:space="preserve">алергіями. Сільпо вже знає сім'ю, обмеження й адресу — просто ці дані ніхто не використовує.</w:t>
       </w:r>
       <w:r>
         <w:rPr>
@@ -1799,32 +1749,32 @@
           <w:spacing w:val="0"/>
           <w:color w:val="343434"/>
         </w:rPr>
-        <w:t xml:space="preserve">зібраний кошик і посилання на оформлення — на виході. Все через офіційний Silpo MCP-сервер,</w:t>
-      </w:r>
-      <w:r>
-        <w:rPr>
-          <w:rFonts w:ascii="Arial" w:hAnsi="Arial" w:cs="Arial"/>
-          <w:sz w:val="29"/>
-          <w:sz-cs w:val="29"/>
-          <w:spacing w:val="0"/>
-          <w:color w:val="343434"/>
-        </w:rPr>
-        <w:t xml:space="preserve"/>
-      </w:r>
-    </w:p>
-    <w:p>
-      <w:pPr>
-        <w:spacing w:after="293"/>
-      </w:pPr>
-      <w:r>
-        <w:rPr>
-          <w:rFonts w:ascii="Arial" w:hAnsi="Arial" w:cs="Arial"/>
-          <w:sz w:val="29"/>
-          <w:sz-cs w:val="29"/>
-          <w:spacing w:val="0"/>
-          <w:color w:val="343434"/>
-        </w:rPr>
-        <w:t xml:space="preserve">проти справжнього акаунта, без пісочниці й без вигаданих даних.</w:t>
+        <w:t xml:space="preserve">кошик і посилання на оформлення — на виході. Через офіційний Silpo MCP, на справжньому акаунті,</w:t>
+      </w:r>
+      <w:r>
+        <w:rPr>
+          <w:rFonts w:ascii="Arial" w:hAnsi="Arial" w:cs="Arial"/>
+          <w:sz w:val="29"/>
+          <w:sz-cs w:val="29"/>
+          <w:spacing w:val="0"/>
+          <w:color w:val="343434"/>
+        </w:rPr>
+        <w:t xml:space="preserve"/>
+      </w:r>
+    </w:p>
+    <w:p>
+      <w:pPr>
+        <w:spacing w:after="293"/>
+      </w:pPr>
+      <w:r>
+        <w:rPr>
+          <w:rFonts w:ascii="Arial" w:hAnsi="Arial" w:cs="Arial"/>
+          <w:sz w:val="29"/>
+          <w:sz-cs w:val="29"/>
+          <w:spacing w:val="0"/>
+          <w:color w:val="343434"/>
+        </w:rPr>
+        <w:t xml:space="preserve">без вигаданих даних.</w:t>
       </w:r>
       <w:r>
         <w:rPr>
@@ -1896,82 +1846,57 @@
           <w:spacing w:val="0"/>
           <w:color w:val="343434"/>
         </w:rPr>
-        <w:t xml:space="preserve">Модель вирішує ЩО і КОЛИ, а не ЯК. Чотири кроки — встановити контекст кошика, підібрати товари,</w:t>
-      </w:r>
-      <w:r>
-        <w:rPr>
-          <w:rFonts w:ascii="Arial" w:hAnsi="Arial" w:cs="Arial"/>
-          <w:sz w:val="29"/>
-          <w:sz-cs w:val="29"/>
-          <w:spacing w:val="0"/>
-          <w:color w:val="343434"/>
-        </w:rPr>
-        <w:t xml:space="preserve"/>
-      </w:r>
-    </w:p>
-    <w:p>
-      <w:pPr>
-        <w:spacing w:after="293"/>
-      </w:pPr>
-      <w:r>
-        <w:rPr>
-          <w:rFonts w:ascii="Arial" w:hAnsi="Arial" w:cs="Arial"/>
-          <w:sz w:val="29"/>
-          <w:sz-cs w:val="29"/>
-          <w:spacing w:val="0"/>
-          <w:color w:val="343434"/>
-        </w:rPr>
-        <w:t xml:space="preserve">зафіксувати список, прочитати кошик і видати посилання — виконує звичайний детермінований код,</w:t>
-      </w:r>
-      <w:r>
-        <w:rPr>
-          <w:rFonts w:ascii="Arial" w:hAnsi="Arial" w:cs="Arial"/>
-          <w:sz w:val="29"/>
-          <w:sz-cs w:val="29"/>
-          <w:spacing w:val="0"/>
-          <w:color w:val="343434"/>
-        </w:rPr>
-        <w:t xml:space="preserve"/>
-      </w:r>
-    </w:p>
-    <w:p>
-      <w:pPr>
-        <w:spacing w:after="293"/>
-      </w:pPr>
-      <w:r>
-        <w:rPr>
-          <w:rFonts w:ascii="Arial" w:hAnsi="Arial" w:cs="Arial"/>
-          <w:sz w:val="29"/>
-          <w:sz-cs w:val="29"/>
-          <w:spacing w:val="0"/>
-          <w:color w:val="343434"/>
-        </w:rPr>
-        <w:t xml:space="preserve">а не імпровізація LLM. І модель фізично не має інструменту, який може змінити кошик: усі</w:t>
-      </w:r>
-      <w:r>
-        <w:rPr>
-          <w:rFonts w:ascii="Arial" w:hAnsi="Arial" w:cs="Arial"/>
-          <w:sz w:val="29"/>
-          <w:sz-cs w:val="29"/>
-          <w:spacing w:val="0"/>
-          <w:color w:val="343434"/>
-        </w:rPr>
-        <w:t xml:space="preserve"/>
-      </w:r>
-    </w:p>
-    <w:p>
-      <w:pPr>
-        <w:spacing w:after="293"/>
-      </w:pPr>
-      <w:r>
-        <w:rPr>
-          <w:rFonts w:ascii="Arial" w:hAnsi="Arial" w:cs="Arial"/>
-          <w:sz w:val="29"/>
-          <w:sz-cs w:val="29"/>
-          <w:spacing w:val="0"/>
-          <w:color w:val="343434"/>
-        </w:rPr>
-        <w:t xml:space="preserve">мутуючі дії доступні лише коду, і без натискання кнопки нічого не записується.</w:t>
+        <w:t xml:space="preserve">Модель вирішує ЩО і КОЛИ, а не ЯК — усі чотири кроки від кошика до посилання виконує звичайний</w:t>
+      </w:r>
+      <w:r>
+        <w:rPr>
+          <w:rFonts w:ascii="Arial" w:hAnsi="Arial" w:cs="Arial"/>
+          <w:sz w:val="29"/>
+          <w:sz-cs w:val="29"/>
+          <w:spacing w:val="0"/>
+          <w:color w:val="343434"/>
+        </w:rPr>
+        <w:t xml:space="preserve"/>
+      </w:r>
+    </w:p>
+    <w:p>
+      <w:pPr>
+        <w:spacing w:after="293"/>
+      </w:pPr>
+      <w:r>
+        <w:rPr>
+          <w:rFonts w:ascii="Arial" w:hAnsi="Arial" w:cs="Arial"/>
+          <w:sz w:val="29"/>
+          <w:sz-cs w:val="29"/>
+          <w:spacing w:val="0"/>
+          <w:color w:val="343434"/>
+        </w:rPr>
+        <w:t xml:space="preserve">код, не LLM. І модель фізично не має інструменту, який змінює кошик: без натискання кнопки</w:t>
+      </w:r>
+      <w:r>
+        <w:rPr>
+          <w:rFonts w:ascii="Arial" w:hAnsi="Arial" w:cs="Arial"/>
+          <w:sz w:val="29"/>
+          <w:sz-cs w:val="29"/>
+          <w:spacing w:val="0"/>
+          <w:color w:val="343434"/>
+        </w:rPr>
+        <w:t xml:space="preserve"/>
+      </w:r>
+    </w:p>
+    <w:p>
+      <w:pPr>
+        <w:spacing w:after="293"/>
+      </w:pPr>
+      <w:r>
+        <w:rPr>
+          <w:rFonts w:ascii="Arial" w:hAnsi="Arial" w:cs="Arial"/>
+          <w:sz w:val="29"/>
+          <w:sz-cs w:val="29"/>
+          <w:spacing w:val="0"/>
+          <w:color w:val="343434"/>
+        </w:rPr>
+        <w:t xml:space="preserve">нічого не записується.</w:t>
       </w:r>
       <w:r>
         <w:rPr>
@@ -2011,107 +1936,57 @@
           <w:spacing w:val="0"/>
           <w:color w:val="343434"/>
         </w:rPr>
-        <w:t xml:space="preserve">Бот читає всі 40 інструментів з реального сервера під час старту — жодна форма аргументів не</w:t>
-      </w:r>
-      <w:r>
-        <w:rPr>
-          <w:rFonts w:ascii="Arial" w:hAnsi="Arial" w:cs="Arial"/>
-          <w:sz w:val="29"/>
-          <w:sz-cs w:val="29"/>
-          <w:spacing w:val="0"/>
-          <w:color w:val="343434"/>
-        </w:rPr>
-        <w:t xml:space="preserve"/>
-      </w:r>
-    </w:p>
-    <w:p>
-      <w:pPr>
-        <w:spacing w:after="293"/>
-      </w:pPr>
-      <w:r>
-        <w:rPr>
-          <w:rFonts w:ascii="Arial" w:hAnsi="Arial" w:cs="Arial"/>
-          <w:sz w:val="29"/>
-          <w:sz-cs w:val="29"/>
-          <w:spacing w:val="0"/>
-          <w:color w:val="343434"/>
-        </w:rPr>
-        <w:t xml:space="preserve">захардкоджена. Моделі доступні 33 read-інструменти з шести категорій: профіль, пошук товарів,</w:t>
-      </w:r>
-      <w:r>
-        <w:rPr>
-          <w:rFonts w:ascii="Arial" w:hAnsi="Arial" w:cs="Arial"/>
-          <w:sz w:val="29"/>
-          <w:sz-cs w:val="29"/>
-          <w:spacing w:val="0"/>
-          <w:color w:val="343434"/>
-        </w:rPr>
-        <w:t xml:space="preserve"/>
-      </w:r>
-    </w:p>
-    <w:p>
-      <w:pPr>
-        <w:spacing w:after="293"/>
-      </w:pPr>
-      <w:r>
-        <w:rPr>
-          <w:rFonts w:ascii="Arial" w:hAnsi="Arial" w:cs="Arial"/>
-          <w:sz w:val="29"/>
-          <w:sz-cs w:val="29"/>
-          <w:spacing w:val="0"/>
-          <w:color w:val="343434"/>
-        </w:rPr>
-        <w:t xml:space="preserve">акції, кошик, доставка, лояльність. Сім інструментів, які можуть змінити акаунт, — недоступні</w:t>
-      </w:r>
-      <w:r>
-        <w:rPr>
-          <w:rFonts w:ascii="Arial" w:hAnsi="Arial" w:cs="Arial"/>
-          <w:sz w:val="29"/>
-          <w:sz-cs w:val="29"/>
-          <w:spacing w:val="0"/>
-          <w:color w:val="343434"/>
-        </w:rPr>
-        <w:t xml:space="preserve"/>
-      </w:r>
-    </w:p>
-    <w:p>
-      <w:pPr>
-        <w:spacing w:after="293"/>
-      </w:pPr>
-      <w:r>
-        <w:rPr>
-          <w:rFonts w:ascii="Arial" w:hAnsi="Arial" w:cs="Arial"/>
-          <w:sz w:val="29"/>
-          <w:sz-cs w:val="29"/>
-          <w:spacing w:val="0"/>
-          <w:color w:val="343434"/>
-        </w:rPr>
-        <w:t xml:space="preserve">моделі взагалі, лише нашому коду. Кожен виклик логується: інструмент, аргументи, статус,</w:t>
-      </w:r>
-      <w:r>
-        <w:rPr>
-          <w:rFonts w:ascii="Arial" w:hAnsi="Arial" w:cs="Arial"/>
-          <w:sz w:val="29"/>
-          <w:sz-cs w:val="29"/>
-          <w:spacing w:val="0"/>
-          <w:color w:val="343434"/>
-        </w:rPr>
-        <w:t xml:space="preserve"/>
-      </w:r>
-    </w:p>
-    <w:p>
-      <w:pPr>
-        <w:spacing w:after="293"/>
-      </w:pPr>
-      <w:r>
-        <w:rPr>
-          <w:rFonts w:ascii="Arial" w:hAnsi="Arial" w:cs="Arial"/>
-          <w:sz w:val="29"/>
-          <w:sz-cs w:val="29"/>
-          <w:spacing w:val="0"/>
-          <w:color w:val="343434"/>
-        </w:rPr>
-        <w:t xml:space="preserve">тривалість.</w:t>
+        <w:t xml:space="preserve">Бот читає всі 40 інструментів з реального сервера — нічого не захардкоджено. Моделі доступні 33</w:t>
+      </w:r>
+      <w:r>
+        <w:rPr>
+          <w:rFonts w:ascii="Arial" w:hAnsi="Arial" w:cs="Arial"/>
+          <w:sz w:val="29"/>
+          <w:sz-cs w:val="29"/>
+          <w:spacing w:val="0"/>
+          <w:color w:val="343434"/>
+        </w:rPr>
+        <w:t xml:space="preserve"/>
+      </w:r>
+    </w:p>
+    <w:p>
+      <w:pPr>
+        <w:spacing w:after="293"/>
+      </w:pPr>
+      <w:r>
+        <w:rPr>
+          <w:rFonts w:ascii="Arial" w:hAnsi="Arial" w:cs="Arial"/>
+          <w:sz w:val="29"/>
+          <w:sz-cs w:val="29"/>
+          <w:spacing w:val="0"/>
+          <w:color w:val="343434"/>
+        </w:rPr>
+        <w:t xml:space="preserve">read-інструменти з шести категорій; сім, що можуть змінити акаунт, — лише нашому коду. Кожен</w:t>
+      </w:r>
+      <w:r>
+        <w:rPr>
+          <w:rFonts w:ascii="Arial" w:hAnsi="Arial" w:cs="Arial"/>
+          <w:sz w:val="29"/>
+          <w:sz-cs w:val="29"/>
+          <w:spacing w:val="0"/>
+          <w:color w:val="343434"/>
+        </w:rPr>
+        <w:t xml:space="preserve"/>
+      </w:r>
+    </w:p>
+    <w:p>
+      <w:pPr>
+        <w:spacing w:after="293"/>
+      </w:pPr>
+      <w:r>
+        <w:rPr>
+          <w:rFonts w:ascii="Arial" w:hAnsi="Arial" w:cs="Arial"/>
+          <w:sz w:val="29"/>
+          <w:sz-cs w:val="29"/>
+          <w:spacing w:val="0"/>
+          <w:color w:val="343434"/>
+        </w:rPr>
+        <w:t xml:space="preserve">виклик логується.</w:t>
       </w:r>
       <w:r>
         <w:rPr>
@@ -2317,7 +2192,7 @@
           <w:i/>
           <w:spacing w:val="0"/>
         </w:rPr>
-        <w:t xml:space="preserve">тут нічого не набрано мною вручну — це профіль і обмеження, прочитані наживо з Silpo MCP.</w:t>
+        <w:t xml:space="preserve">нічого тут не набрано мною вручну — це профіль, прочитаний наживо з Silpo MCP.</w:t>
       </w:r>
       <w:r>
         <w:rPr>
@@ -2532,7 +2407,7 @@
           <w:sz-cs w:val="29"/>
           <w:spacing w:val="0"/>
         </w:rPr>
-        <w:t xml:space="preserve">Наголосити: ніде свинини, розраховано на чотирьох — жодного з цих фактів не було в набраному повідомленні.</w:t>
+        <w:t xml:space="preserve">Наголосити: ніде свинини, на чотирьох — цього не було в повідомленні.</w:t>
       </w:r>
     </w:p>
     <w:p>
@@ -2711,61 +2586,7 @@
           <w:sz-cs w:val="29"/>
           <w:spacing w:val="0"/>
         </w:rPr>
-        <w:t xml:space="preserve">Розповісти: 🔥 — це справжня акція, зчитана по кожному товару з полів </w:t>
-      </w:r>
-      <w:r>
-        <w:rPr>
-          <w:rFonts w:ascii="Courier" w:hAnsi="Courier" w:cs="Courier"/>
-          <w:sz w:val="29"/>
-          <w:sz-cs w:val="29"/>
-          <w:spacing w:val="0"/>
-        </w:rPr>
-        <w:t xml:space="preserve">specialPrices</w:t>
-      </w:r>
-      <w:r>
-        <w:rPr>
-          <w:rFonts w:ascii="Arial" w:hAnsi="Arial" w:cs="Arial"/>
-          <w:sz w:val="29"/>
-          <w:sz-cs w:val="29"/>
-          <w:spacing w:val="0"/>
-        </w:rPr>
-        <w:t xml:space="preserve">/</w:t>
-      </w:r>
-      <w:r>
-        <w:rPr>
-          <w:rFonts w:ascii="Courier" w:hAnsi="Courier" w:cs="Courier"/>
-          <w:sz w:val="29"/>
-          <w:sz-cs w:val="29"/>
-          <w:spacing w:val="0"/>
-        </w:rPr>
-        <w:t xml:space="preserve">oldPrice</w:t>
-      </w:r>
-      <w:r>
-        <w:rPr>
-          <w:rFonts w:ascii="Arial" w:hAnsi="Arial" w:cs="Arial"/>
-          <w:sz w:val="29"/>
-          <w:sz-cs w:val="29"/>
-          <w:spacing w:val="0"/>
-        </w:rPr>
-        <w:t xml:space="preserve">; 🔄 — заміна, отримана через </w:t>
-      </w:r>
-      <w:r>
-        <w:rPr>
-          <w:rFonts w:ascii="Courier" w:hAnsi="Courier" w:cs="Courier"/>
-          <w:sz w:val="29"/>
-          <w:sz-cs w:val="29"/>
-          <w:spacing w:val="0"/>
-        </w:rPr>
-        <w:t xml:space="preserve">silpo_get_replacements</w:t>
-      </w:r>
-      <w:r>
-        <w:rPr>
-          <w:rFonts w:ascii="Arial" w:hAnsi="Arial" w:cs="Arial"/>
-          <w:sz w:val="29"/>
-          <w:sz-cs w:val="29"/>
-          <w:spacing w:val="0"/>
-        </w:rPr>
-        <w:t xml:space="preserve">, бо первинний вибір закінчився на складі. </w:t>
+        <w:t xml:space="preserve">Розповісти: 🔥 — реальна акція з полів товару, 🔄 — заміна, бо перший вибір закінчився на складі. </w:t>
       </w:r>
       <w:r>
         <w:rPr>
@@ -2775,7 +2596,7 @@
           <w:i/>
           <w:spacing w:val="0"/>
         </w:rPr>
-        <w:t xml:space="preserve">Кожна назва й ціна на цьому екрані взяті з результату інструмента — модель не може їх вигадати.</w:t>
+        <w:t xml:space="preserve">Кожна назва й ціна тут — з результату інструмента, не від моделі.</w:t>
       </w:r>
       <w:r>
         <w:rPr>
@@ -3014,82 +2835,57 @@
           <w:spacing w:val="0"/>
           <w:color w:val="343434"/>
         </w:rPr>
-        <w:t xml:space="preserve">Для гостя: менше часу на рутину, повніший і дешевший кошик — акції перевірені по кожній позиції,</w:t>
-      </w:r>
-      <w:r>
-        <w:rPr>
-          <w:rFonts w:ascii="Arial" w:hAnsi="Arial" w:cs="Arial"/>
-          <w:sz w:val="29"/>
-          <w:sz-cs w:val="29"/>
-          <w:spacing w:val="0"/>
-          <w:color w:val="343434"/>
-        </w:rPr>
-        <w:t xml:space="preserve"/>
-      </w:r>
-    </w:p>
-    <w:p>
-      <w:pPr>
-        <w:spacing w:after="293"/>
-      </w:pPr>
-      <w:r>
-        <w:rPr>
-          <w:rFonts w:ascii="Arial" w:hAnsi="Arial" w:cs="Arial"/>
-          <w:sz w:val="29"/>
-          <w:sz-cs w:val="29"/>
-          <w:spacing w:val="0"/>
-          <w:color w:val="343434"/>
-        </w:rPr>
-        <w:t xml:space="preserve">а не вибірково, і жодного ризику купити заборонений продукт, бо обмеження — тверде правило в</w:t>
-      </w:r>
-      <w:r>
-        <w:rPr>
-          <w:rFonts w:ascii="Arial" w:hAnsi="Arial" w:cs="Arial"/>
-          <w:sz w:val="29"/>
-          <w:sz-cs w:val="29"/>
-          <w:spacing w:val="0"/>
-          <w:color w:val="343434"/>
-        </w:rPr>
-        <w:t xml:space="preserve"/>
-      </w:r>
-    </w:p>
-    <w:p>
-      <w:pPr>
-        <w:spacing w:after="293"/>
-      </w:pPr>
-      <w:r>
-        <w:rPr>
-          <w:rFonts w:ascii="Arial" w:hAnsi="Arial" w:cs="Arial"/>
-          <w:sz w:val="29"/>
-          <w:sz-cs w:val="29"/>
-          <w:spacing w:val="0"/>
-          <w:color w:val="343434"/>
-        </w:rPr>
-        <w:t xml:space="preserve">коді, не прохання до моделі. Для бізнесу: більші кошики і вище викуп акційних товарів, бо агент</w:t>
-      </w:r>
-      <w:r>
-        <w:rPr>
-          <w:rFonts w:ascii="Arial" w:hAnsi="Arial" w:cs="Arial"/>
-          <w:sz w:val="29"/>
-          <w:sz-cs w:val="29"/>
-          <w:spacing w:val="0"/>
-          <w:color w:val="343434"/>
-        </w:rPr>
-        <w:t xml:space="preserve"/>
-      </w:r>
-    </w:p>
-    <w:p>
-      <w:pPr>
-        <w:spacing w:after="293"/>
-      </w:pPr>
-      <w:r>
-        <w:rPr>
-          <w:rFonts w:ascii="Arial" w:hAnsi="Arial" w:cs="Arial"/>
-          <w:sz w:val="29"/>
-          <w:sz-cs w:val="29"/>
-          <w:spacing w:val="0"/>
-          <w:color w:val="343434"/>
-        </w:rPr>
-        <w:t xml:space="preserve">перевіряє те, що покупець вручну ніколи не перевіряє повністю.</w:t>
+        <w:t xml:space="preserve">Для гостя: менше часу, повніший і дешевший кошик — акції перевірені по кожній позиції, і</w:t>
+      </w:r>
+      <w:r>
+        <w:rPr>
+          <w:rFonts w:ascii="Arial" w:hAnsi="Arial" w:cs="Arial"/>
+          <w:sz w:val="29"/>
+          <w:sz-cs w:val="29"/>
+          <w:spacing w:val="0"/>
+          <w:color w:val="343434"/>
+        </w:rPr>
+        <w:t xml:space="preserve"/>
+      </w:r>
+    </w:p>
+    <w:p>
+      <w:pPr>
+        <w:spacing w:after="293"/>
+      </w:pPr>
+      <w:r>
+        <w:rPr>
+          <w:rFonts w:ascii="Arial" w:hAnsi="Arial" w:cs="Arial"/>
+          <w:sz w:val="29"/>
+          <w:sz-cs w:val="29"/>
+          <w:spacing w:val="0"/>
+          <w:color w:val="343434"/>
+        </w:rPr>
+        <w:t xml:space="preserve">жодного ризику купити заборонене, бо обмеження — правило коду, не прохання до моделі. Для</w:t>
+      </w:r>
+      <w:r>
+        <w:rPr>
+          <w:rFonts w:ascii="Arial" w:hAnsi="Arial" w:cs="Arial"/>
+          <w:sz w:val="29"/>
+          <w:sz-cs w:val="29"/>
+          <w:spacing w:val="0"/>
+          <w:color w:val="343434"/>
+        </w:rPr>
+        <w:t xml:space="preserve"/>
+      </w:r>
+    </w:p>
+    <w:p>
+      <w:pPr>
+        <w:spacing w:after="293"/>
+      </w:pPr>
+      <w:r>
+        <w:rPr>
+          <w:rFonts w:ascii="Arial" w:hAnsi="Arial" w:cs="Arial"/>
+          <w:sz w:val="29"/>
+          <w:sz-cs w:val="29"/>
+          <w:spacing w:val="0"/>
+          <w:color w:val="343434"/>
+        </w:rPr>
+        <w:t xml:space="preserve">бізнесу: більші кошики й вищий викуп акційних товарів.</w:t>
       </w:r>
       <w:r>
         <w:rPr>
@@ -3228,7 +3024,7 @@
           <w:sz-cs w:val="29"/>
           <w:spacing w:val="0"/>
         </w:rPr>
-        <w:t xml:space="preserve">Сказати вголос, підставивши реальні числа з цього прогону: </w:t>
+        <w:t xml:space="preserve">Підставити реальні числа з цього прогону: </w:t>
       </w:r>
       <w:r>
         <w:rPr>
@@ -3238,7 +3034,7 @@
           <w:i/>
           <w:spacing w:val="0"/>
         </w:rPr>
-        <w:t xml:space="preserve">час від запиту до посилання на оформлення, кількість викликів MCP по N різних інструментах, частка акційних товарів і частка замін — вони вже показані наживо як «🔥 K акційних · 🔄 M замін» — і все це коштувало ~$0.003 за запит завдяки кешуванню промпту на блоці інструментів.</w:t>
+        <w:t xml:space="preserve">час до посилання на оформлення, кількість викликів MCP, частка акційних і замін — уже видно як «🔥 K · 🔄 M» — і все це ~$0.003 за запит завдяки кешуванню промпту.</w:t>
       </w:r>
       <w:r>
         <w:rPr>
@@ -3277,82 +3073,57 @@
           <w:spacing w:val="0"/>
           <w:color w:val="343434"/>
         </w:rPr>
-        <w:t xml:space="preserve">Той самий агент — усередині самого застосунку Сільпо, оскільки весь потік вже завершується на</w:t>
-      </w:r>
-      <w:r>
-        <w:rPr>
-          <w:rFonts w:ascii="Arial" w:hAnsi="Arial" w:cs="Arial"/>
-          <w:sz w:val="29"/>
-          <w:sz-cs w:val="29"/>
-          <w:spacing w:val="0"/>
-          <w:color w:val="343434"/>
-        </w:rPr>
-        <w:t xml:space="preserve"/>
-      </w:r>
-    </w:p>
-    <w:p>
-      <w:pPr>
-        <w:spacing w:after="293"/>
-      </w:pPr>
-      <w:r>
-        <w:rPr>
-          <w:rFonts w:ascii="Arial" w:hAnsi="Arial" w:cs="Arial"/>
-          <w:sz w:val="29"/>
-          <w:sz-cs w:val="29"/>
-          <w:spacing w:val="0"/>
-          <w:color w:val="343434"/>
-        </w:rPr>
-        <w:t xml:space="preserve">справжньому checkout Сільпо. План уже зберігається в базі — «Повтори минулий план» працює</w:t>
-      </w:r>
-      <w:r>
-        <w:rPr>
-          <w:rFonts w:ascii="Arial" w:hAnsi="Arial" w:cs="Arial"/>
-          <w:sz w:val="29"/>
-          <w:sz-cs w:val="29"/>
-          <w:spacing w:val="0"/>
-          <w:color w:val="343434"/>
-        </w:rPr>
-        <w:t xml:space="preserve"/>
-      </w:r>
-    </w:p>
-    <w:p>
-      <w:pPr>
-        <w:spacing w:after="293"/>
-      </w:pPr>
-      <w:r>
-        <w:rPr>
-          <w:rFonts w:ascii="Arial" w:hAnsi="Arial" w:cs="Arial"/>
-          <w:sz w:val="29"/>
-          <w:sz-cs w:val="29"/>
-          <w:spacing w:val="0"/>
-          <w:color w:val="343434"/>
-        </w:rPr>
-        <w:t xml:space="preserve">сьогодні, тож щотижневий авто-план по четвергах — наступний логічний крок. І інверсія: замість</w:t>
-      </w:r>
-      <w:r>
-        <w:rPr>
-          <w:rFonts w:ascii="Arial" w:hAnsi="Arial" w:cs="Arial"/>
-          <w:sz w:val="29"/>
-          <w:sz-cs w:val="29"/>
-          <w:spacing w:val="0"/>
-          <w:color w:val="343434"/>
-        </w:rPr>
-        <w:t xml:space="preserve"/>
-      </w:r>
-    </w:p>
-    <w:p>
-      <w:pPr>
-        <w:spacing w:after="293"/>
-      </w:pPr>
-      <w:r>
-        <w:rPr>
-          <w:rFonts w:ascii="Arial" w:hAnsi="Arial" w:cs="Arial"/>
-          <w:sz w:val="29"/>
-          <w:sz-cs w:val="29"/>
-          <w:spacing w:val="0"/>
-          <w:color w:val="343434"/>
-        </w:rPr>
-        <w:t xml:space="preserve">підбирати акції під обране меню, будувати меню з цьогорічних акцій напряму.</w:t>
+        <w:t xml:space="preserve">Той самий агент — усередині застосунку Сільпо, бо потік уже завершується на справжньому</w:t>
+      </w:r>
+      <w:r>
+        <w:rPr>
+          <w:rFonts w:ascii="Arial" w:hAnsi="Arial" w:cs="Arial"/>
+          <w:sz w:val="29"/>
+          <w:sz-cs w:val="29"/>
+          <w:spacing w:val="0"/>
+          <w:color w:val="343434"/>
+        </w:rPr>
+        <w:t xml:space="preserve"/>
+      </w:r>
+    </w:p>
+    <w:p>
+      <w:pPr>
+        <w:spacing w:after="293"/>
+      </w:pPr>
+      <w:r>
+        <w:rPr>
+          <w:rFonts w:ascii="Arial" w:hAnsi="Arial" w:cs="Arial"/>
+          <w:sz w:val="29"/>
+          <w:sz-cs w:val="29"/>
+          <w:spacing w:val="0"/>
+          <w:color w:val="343434"/>
+        </w:rPr>
+        <w:t xml:space="preserve">checkout. План зберігається в базі, тож щотижневий авто-план — наступний крок. І інверсія:</w:t>
+      </w:r>
+      <w:r>
+        <w:rPr>
+          <w:rFonts w:ascii="Arial" w:hAnsi="Arial" w:cs="Arial"/>
+          <w:sz w:val="29"/>
+          <w:sz-cs w:val="29"/>
+          <w:spacing w:val="0"/>
+          <w:color w:val="343434"/>
+        </w:rPr>
+        <w:t xml:space="preserve"/>
+      </w:r>
+    </w:p>
+    <w:p>
+      <w:pPr>
+        <w:spacing w:after="293"/>
+      </w:pPr>
+      <w:r>
+        <w:rPr>
+          <w:rFonts w:ascii="Arial" w:hAnsi="Arial" w:cs="Arial"/>
+          <w:sz w:val="29"/>
+          <w:sz-cs w:val="29"/>
+          <w:spacing w:val="0"/>
+          <w:color w:val="343434"/>
+        </w:rPr>
+        <w:t xml:space="preserve">будувати меню з акцій напряму, а не навпаки.</w:t>
       </w:r>
       <w:r>
         <w:rPr>

</xml_diff>